<commit_message>
Upload codebase files src/app/dashboard/pv/page.tsx
</commit_message>
<xml_diff>
--- a/public/templates/Essai-PV-SoutenanceRGL.docx
+++ b/public/templates/Essai-PV-SoutenanceRGL.docx
@@ -292,7 +292,33 @@
                 <w:bCs/>
                 <w:sz w:val="22"/>
               </w:rPr>
-              <w:t xml:space="preserve">Licence </w:t>
+              <w:t>&lt;&lt;</w:t>
+            </w:r>
+            <w:proofErr w:type="spellStart"/>
+            <w:r>
+              <w:rPr>
+                <w:b/>
+                <w:bCs/>
+                <w:sz w:val="22"/>
+              </w:rPr>
+              <w:t>Diploma</w:t>
+            </w:r>
+            <w:proofErr w:type="spellEnd"/>
+            <w:r>
+              <w:rPr>
+                <w:b/>
+                <w:bCs/>
+                <w:sz w:val="22"/>
+              </w:rPr>
+              <w:t>&gt;&gt;</w:t>
+            </w:r>
+            <w:r>
+              <w:rPr>
+                <w:b/>
+                <w:bCs/>
+                <w:sz w:val="22"/>
+              </w:rPr>
+              <w:t xml:space="preserve"> </w:t>
             </w:r>
             <w:r>
               <w:rPr>
@@ -393,23 +419,25 @@
                 <w:bCs/>
                 <w:sz w:val="22"/>
               </w:rPr>
-              <w:t>RGL</w:t>
-            </w:r>
+              <w:t>&lt;&lt;</w:t>
+            </w:r>
+            <w:proofErr w:type="spellStart"/>
             <w:r>
               <w:rPr>
                 <w:b/>
                 <w:bCs/>
                 <w:sz w:val="22"/>
               </w:rPr>
-              <w:t xml:space="preserve"> - </w:t>
-            </w:r>
+              <w:t>Speciality</w:t>
+            </w:r>
+            <w:proofErr w:type="spellEnd"/>
             <w:r>
               <w:rPr>
                 <w:b/>
                 <w:bCs/>
                 <w:sz w:val="22"/>
               </w:rPr>
-              <w:t>Réseaux et Génie Logiciel</w:t>
+              <w:t>&gt;&gt;</w:t>
             </w:r>
           </w:p>
         </w:tc>
@@ -420,65 +448,119 @@
         <w:spacing w:before="120"/>
         <w:rPr>
           <w:szCs w:val="20"/>
+          <w:lang w:val="en-US"/>
         </w:rPr>
       </w:pPr>
       <w:r>
         <w:rPr>
           <w:szCs w:val="20"/>
+          <w:lang w:val="en-US"/>
         </w:rPr>
-        <w:t xml:space="preserve">Session de </w:t>
+        <w:t xml:space="preserve">Session </w:t>
+      </w:r>
+      <w:proofErr w:type="gramStart"/>
+      <w:r>
+        <w:rPr>
+          <w:szCs w:val="20"/>
+          <w:lang w:val="en-US"/>
+        </w:rPr>
+        <w:t xml:space="preserve">de </w:t>
       </w:r>
       <w:r>
         <w:rPr>
           <w:szCs w:val="20"/>
+          <w:lang w:val="en-US"/>
         </w:rPr>
-        <w:t xml:space="preserve">: </w:t>
+        <w:t>:</w:t>
+      </w:r>
+      <w:proofErr w:type="gramEnd"/>
+      <w:r>
+        <w:rPr>
+          <w:szCs w:val="20"/>
+          <w:lang w:val="en-US"/>
+        </w:rPr>
+        <w:t xml:space="preserve"> </w:t>
       </w:r>
       <w:r>
         <w:rPr>
           <w:szCs w:val="20"/>
+          <w:lang w:val="en-US"/>
         </w:rPr>
-        <w:t>Mai</w:t>
+        <w:t>&lt;&lt;</w:t>
+      </w:r>
+      <w:proofErr w:type="spellStart"/>
+      <w:r>
+        <w:rPr>
+          <w:szCs w:val="20"/>
+          <w:lang w:val="en-US"/>
+        </w:rPr>
+        <w:t>session_month</w:t>
+      </w:r>
+      <w:proofErr w:type="spellEnd"/>
+      <w:r>
+        <w:rPr>
+          <w:szCs w:val="20"/>
+          <w:lang w:val="en-US"/>
+        </w:rPr>
+        <w:t>&gt;&gt; &lt;&lt;</w:t>
+      </w:r>
+      <w:proofErr w:type="spellStart"/>
+      <w:r>
+        <w:rPr>
+          <w:szCs w:val="20"/>
+          <w:lang w:val="en-US"/>
+        </w:rPr>
+        <w:t>session_year</w:t>
+      </w:r>
+      <w:proofErr w:type="spellEnd"/>
+      <w:r>
+        <w:rPr>
+          <w:szCs w:val="20"/>
+          <w:lang w:val="en-US"/>
+        </w:rPr>
+        <w:t>&gt;&gt;</w:t>
       </w:r>
       <w:r>
         <w:rPr>
           <w:szCs w:val="20"/>
-        </w:rPr>
-        <w:t xml:space="preserve"> 202</w:t>
-      </w:r>
-      <w:r>
-        <w:rPr>
-          <w:szCs w:val="20"/>
-        </w:rPr>
-        <w:t>3</w:t>
-      </w:r>
-      <w:r>
-        <w:rPr>
-          <w:szCs w:val="20"/>
+          <w:lang w:val="en-US"/>
         </w:rPr>
         <w:tab/>
       </w:r>
       <w:r>
         <w:rPr>
           <w:szCs w:val="20"/>
+          <w:lang w:val="en-US"/>
         </w:rPr>
         <w:tab/>
       </w:r>
       <w:r>
         <w:rPr>
           <w:szCs w:val="20"/>
+          <w:lang w:val="en-US"/>
         </w:rPr>
-        <w:t>Jury N°</w:t>
+        <w:t>Jury N</w:t>
+      </w:r>
+      <w:proofErr w:type="gramStart"/>
+      <w:r>
+        <w:rPr>
+          <w:szCs w:val="20"/>
+          <w:lang w:val="en-US"/>
+        </w:rPr>
+        <w:t>°</w:t>
       </w:r>
       <w:r>
         <w:rPr>
           <w:szCs w:val="20"/>
+          <w:lang w:val="en-US"/>
         </w:rPr>
         <w:t> :</w:t>
       </w:r>
+      <w:proofErr w:type="gramEnd"/>
       <w:r>
         <w:rPr>
           <w:szCs w:val="20"/>
+          <w:lang w:val="en-US"/>
         </w:rPr>
         <w:t xml:space="preserve"> </w:t>
       </w:r>
@@ -491,6 +573,7 @@
       <w:r>
         <w:rPr>
           <w:szCs w:val="20"/>
+          <w:lang w:val="en-US"/>
         </w:rPr>
         <w:instrText xml:space="preserve"> MERGEFIELD Jury </w:instrText>
       </w:r>
@@ -504,6 +587,7 @@
         <w:rPr>
           <w:noProof/>
           <w:szCs w:val="20"/>
+          <w:lang w:val="en-US"/>
         </w:rPr>
         <w:t>«Jury»</w:t>
       </w:r>
@@ -516,24 +600,30 @@
       <w:r>
         <w:rPr>
           <w:szCs w:val="20"/>
+          <w:lang w:val="en-US"/>
         </w:rPr>
         <w:tab/>
       </w:r>
       <w:r>
         <w:rPr>
           <w:szCs w:val="20"/>
+          <w:lang w:val="en-US"/>
         </w:rPr>
         <w:tab/>
       </w:r>
+      <w:proofErr w:type="gramStart"/>
       <w:r>
         <w:rPr>
           <w:szCs w:val="20"/>
+          <w:lang w:val="en-US"/>
         </w:rPr>
         <w:t>Salle :</w:t>
       </w:r>
+      <w:proofErr w:type="gramEnd"/>
       <w:r>
         <w:rPr>
           <w:szCs w:val="20"/>
+          <w:lang w:val="en-US"/>
         </w:rPr>
         <w:t xml:space="preserve"> </w:t>
       </w:r>
@@ -546,6 +636,7 @@
       <w:r>
         <w:rPr>
           <w:szCs w:val="20"/>
+          <w:lang w:val="en-US"/>
         </w:rPr>
         <w:instrText xml:space="preserve"> MERGEFIELD Salle </w:instrText>
       </w:r>
@@ -559,6 +650,7 @@
         <w:rPr>
           <w:noProof/>
           <w:szCs w:val="20"/>
+          <w:lang w:val="en-US"/>
         </w:rPr>
         <w:t>«Salle»</w:t>
       </w:r>
@@ -4137,7 +4229,6 @@
               <w:bottom w:val="single" w:sz="8" w:space="0" w:color="auto"/>
               <w:right w:val="single" w:sz="8" w:space="0" w:color="auto"/>
             </w:tcBorders>
-            <w:shd w:val="clear" w:color="auto" w:fill="auto"/>
             <w:vAlign w:val="center"/>
             <w:hideMark/>
           </w:tcPr>
@@ -4186,7 +4277,6 @@
               <w:bottom w:val="single" w:sz="8" w:space="0" w:color="auto"/>
               <w:right w:val="single" w:sz="8" w:space="0" w:color="auto"/>
             </w:tcBorders>
-            <w:shd w:val="clear" w:color="auto" w:fill="auto"/>
             <w:vAlign w:val="center"/>
             <w:hideMark/>
           </w:tcPr>
@@ -4235,7 +4325,6 @@
               <w:bottom w:val="single" w:sz="8" w:space="0" w:color="auto"/>
               <w:right w:val="single" w:sz="8" w:space="0" w:color="auto"/>
             </w:tcBorders>
-            <w:shd w:val="clear" w:color="auto" w:fill="auto"/>
             <w:vAlign w:val="center"/>
             <w:hideMark/>
           </w:tcPr>
@@ -4284,7 +4373,6 @@
               <w:bottom w:val="single" w:sz="8" w:space="0" w:color="auto"/>
               <w:right w:val="single" w:sz="8" w:space="0" w:color="auto"/>
             </w:tcBorders>
-            <w:shd w:val="clear" w:color="auto" w:fill="auto"/>
             <w:vAlign w:val="center"/>
             <w:hideMark/>
           </w:tcPr>
@@ -4355,7 +4443,6 @@
               <w:bottom w:val="single" w:sz="8" w:space="0" w:color="auto"/>
               <w:right w:val="single" w:sz="8" w:space="0" w:color="auto"/>
             </w:tcBorders>
-            <w:shd w:val="clear" w:color="auto" w:fill="auto"/>
             <w:vAlign w:val="center"/>
             <w:hideMark/>
           </w:tcPr>
@@ -4409,7 +4496,6 @@
               <w:bottom w:val="single" w:sz="8" w:space="0" w:color="auto"/>
               <w:right w:val="single" w:sz="8" w:space="0" w:color="auto"/>
             </w:tcBorders>
-            <w:shd w:val="clear" w:color="auto" w:fill="auto"/>
             <w:vAlign w:val="center"/>
             <w:hideMark/>
           </w:tcPr>
@@ -4447,7 +4533,6 @@
               <w:bottom w:val="single" w:sz="8" w:space="0" w:color="auto"/>
               <w:right w:val="single" w:sz="8" w:space="0" w:color="auto"/>
             </w:tcBorders>
-            <w:shd w:val="clear" w:color="auto" w:fill="auto"/>
             <w:vAlign w:val="center"/>
             <w:hideMark/>
           </w:tcPr>
@@ -4485,7 +4570,6 @@
               <w:bottom w:val="single" w:sz="8" w:space="0" w:color="auto"/>
               <w:right w:val="single" w:sz="8" w:space="0" w:color="auto"/>
             </w:tcBorders>
-            <w:shd w:val="clear" w:color="auto" w:fill="auto"/>
             <w:vAlign w:val="center"/>
             <w:hideMark/>
           </w:tcPr>
@@ -4523,7 +4607,6 @@
               <w:bottom w:val="single" w:sz="8" w:space="0" w:color="auto"/>
               <w:right w:val="single" w:sz="8" w:space="0" w:color="auto"/>
             </w:tcBorders>
-            <w:shd w:val="clear" w:color="auto" w:fill="auto"/>
             <w:vAlign w:val="center"/>
             <w:hideMark/>
           </w:tcPr>
@@ -4561,7 +4644,6 @@
               <w:bottom w:val="single" w:sz="8" w:space="0" w:color="auto"/>
               <w:right w:val="single" w:sz="8" w:space="0" w:color="auto"/>
             </w:tcBorders>
-            <w:shd w:val="clear" w:color="auto" w:fill="auto"/>
             <w:vAlign w:val="center"/>
             <w:hideMark/>
           </w:tcPr>

</xml_diff>

<commit_message>
Initial sync after enabling
</commit_message>
<xml_diff>
--- a/public/templates/Essai-PV-SoutenanceRGL.docx
+++ b/public/templates/Essai-PV-SoutenanceRGL.docx
@@ -292,25 +292,7 @@
                 <w:bCs/>
                 <w:sz w:val="22"/>
               </w:rPr>
-              <w:t>&lt;&lt;</w:t>
-            </w:r>
-            <w:proofErr w:type="spellStart"/>
-            <w:r>
-              <w:rPr>
-                <w:b/>
-                <w:bCs/>
-                <w:sz w:val="22"/>
-              </w:rPr>
-              <w:t>Diploma</w:t>
-            </w:r>
-            <w:proofErr w:type="spellEnd"/>
-            <w:r>
-              <w:rPr>
-                <w:b/>
-                <w:bCs/>
-                <w:sz w:val="22"/>
-              </w:rPr>
-              <w:t>&gt;&gt;</w:t>
+              <w:t>&lt;&lt;Diploma&gt;&gt;</w:t>
             </w:r>
             <w:r>
               <w:rPr>
@@ -419,25 +401,7 @@
                 <w:bCs/>
                 <w:sz w:val="22"/>
               </w:rPr>
-              <w:t>&lt;&lt;</w:t>
-            </w:r>
-            <w:proofErr w:type="spellStart"/>
-            <w:r>
-              <w:rPr>
-                <w:b/>
-                <w:bCs/>
-                <w:sz w:val="22"/>
-              </w:rPr>
-              <w:t>Speciality</w:t>
-            </w:r>
-            <w:proofErr w:type="spellEnd"/>
-            <w:r>
-              <w:rPr>
-                <w:b/>
-                <w:bCs/>
-                <w:sz w:val="22"/>
-              </w:rPr>
-              <w:t>&gt;&gt;</w:t>
+              <w:t>&lt;&lt;Speciality&gt;&gt;</w:t>
             </w:r>
           </w:p>
         </w:tc>
@@ -486,39 +450,14 @@
           <w:szCs w:val="20"/>
           <w:lang w:val="en-US"/>
         </w:rPr>
-        <w:t>&lt;&lt;</w:t>
+        <w:t>&lt;&lt;session_month</w:t>
       </w:r>
-      <w:proofErr w:type="spellStart"/>
       <w:r>
         <w:rPr>
           <w:szCs w:val="20"/>
           <w:lang w:val="en-US"/>
         </w:rPr>
-        <w:t>session_month</w:t>
-      </w:r>
-      <w:proofErr w:type="spellEnd"/>
-      <w:r>
-        <w:rPr>
-          <w:szCs w:val="20"/>
-          <w:lang w:val="en-US"/>
-        </w:rPr>
-        <w:t>&gt;&gt; &lt;&lt;</w:t>
-      </w:r>
-      <w:proofErr w:type="spellStart"/>
-      <w:r>
-        <w:rPr>
-          <w:szCs w:val="20"/>
-          <w:lang w:val="en-US"/>
-        </w:rPr>
-        <w:t>session_year</w:t>
-      </w:r>
-      <w:proofErr w:type="spellEnd"/>
-      <w:r>
-        <w:rPr>
-          <w:szCs w:val="20"/>
-          <w:lang w:val="en-US"/>
-        </w:rPr>
-        <w:t>&gt;&gt;</w:t>
+        <w:t>&gt;&gt; &lt;&lt;session_year&gt;&gt;</w:t>
       </w:r>
       <w:r>
         <w:rPr>
@@ -596,13 +535,6 @@
           <w:szCs w:val="20"/>
         </w:rPr>
         <w:fldChar w:fldCharType="end"/>
-      </w:r>
-      <w:r>
-        <w:rPr>
-          <w:szCs w:val="20"/>
-          <w:lang w:val="en-US"/>
-        </w:rPr>
-        <w:tab/>
       </w:r>
       <w:r>
         <w:rPr>

</xml_diff>